<commit_message>
Handouts: the two standing daily questions on every take-home sheet
John's review of the Session 5 handout found the morning and evening
questions (introduced Session 1) missing from later sheets. They are the
background practice of the whole journey, so every sheet now carries them:
a 10pt italic standing-practice banner under the title on handouts 2-22
(docx + md sources + both templates), all verified still one page, and the
standing block added to the live Session 5 page's take-home section.
Session 1 unchanged (the questions are its week-one practice). Wording
verbatim from Session 1: morning, 'Lord, what are you up to today, and
what do you want me to notice?'; evening, 'What did I notice today?'

Co-Authored-By: Claude Fable 5 <noreply@anthropic.com>
</commit_message>
<xml_diff>
--- a/_implementation-notes/evening-series/FotH Pilot Homework Handout Template DRAFT v1.docx
+++ b/_implementation-notes/evening-series/FotH Pilot Homework Handout Template DRAFT v1.docx
@@ -43,6 +43,20 @@
       </w:r>
     </w:p>
     <w:bookmarkStart w:id="9" w:name="the-practice-week-one"/>
+    <w:p>
+      <w:pPr>
+        <w:spacing w:after="140"/>
+      </w:pPr>
+      <w:r>
+        <w:rPr>
+          <w:i/>
+          <w:iCs/>
+          <w:sz w:val="20"/>
+          <w:szCs w:val="20"/>
+        </w:rPr>
+        <w:t xml:space="preserve">The standing practice, every day of the whole journey — morning, five minutes: “Lord, what are you up to today, and what do you want me to notice?” Evening, one journal line: “What did I notice today?”</w:t>
+      </w:r>
+    </w:p>
     <w:p>
       <w:pPr>
         <w:pStyle w:val="Heading2"/>

</xml_diff>

<commit_message>
Handouts: day boxes belong to the standing questions; session items stand apart
John's layout call on review: the M-Su grids track the standing morning
and evening questions, not the session practice, and the setup read as
confusing with the grids inside the numbered items. Every sheet (2-22,
docx + md, both templates) now runs: title, the standing practice with
both week grids directly under the two questions, one small missed-box
note, then the session's own numbered questions with no grids among them.
The 10pt banner from the previous commit is superseded by this structure.
All 21 sheets Word-verified still one page. Live Session 5 page updated
to describe the same layout.

Co-Authored-By: Claude Fable 5 <noreply@anthropic.com>
</commit_message>
<xml_diff>
--- a/_implementation-notes/evening-series/FotH Pilot Homework Handout Template DRAFT v1.docx
+++ b/_implementation-notes/evening-series/FotH Pilot Homework Handout Template DRAFT v1.docx
@@ -42,58 +42,24 @@
         </w:pict>
       </w:r>
     </w:p>
-    <w:bookmarkStart w:id="9" w:name="the-practice-week-one"/>
     <w:p>
       <w:pPr>
         <w:spacing w:after="140"/>
       </w:pPr>
       <w:r>
         <w:rPr>
-          <w:i/>
-          <w:iCs/>
-          <w:sz w:val="20"/>
-          <w:szCs w:val="20"/>
+          <w:b/>
+          <w:bCs/>
         </w:rPr>
-        <w:t xml:space="preserve">The standing practice, every day of the whole journey — morning, five minutes: “Lord, what are you up to today, and what do you want me to notice?” Evening, one journal line: “What did I notice today?”</w:t>
+        <w:t xml:space="preserve">The standing practice — every day, both weeks. </w:t>
+      </w:r>
+      <w:r>
+        <w:t xml:space="preserve">Morning, five minutes: “Lord, what are you up to today, and what do you want me to notice?” Evening, one journal line: “What did I notice today?”</w:t>
       </w:r>
     </w:p>
     <w:p>
       <w:pPr>
-        <w:pStyle w:val="Heading2"/>
-      </w:pPr>
-      <w:r>
-        <w:t xml:space="preserve">1. The practice — week one</w:t>
-      </w:r>
-    </w:p>
-    <w:p>
-      <w:pPr>
-        <w:pStyle w:val="FirstParagraph"/>
-      </w:pPr>
-      <w:r>
-        <w:rPr>
-          <w:i/>
-          <w:iCs/>
-        </w:rPr>
-        <w:t xml:space="preserve">One practice, stated in two or three sentences, doable in five to ten</w:t>
-      </w:r>
-      <w:r>
-        <w:rPr>
-          <w:i/>
-          <w:iCs/>
-        </w:rPr>
-        <w:t xml:space="preserve"> </w:t>
-      </w:r>
-      <w:r>
-        <w:rPr>
-          <w:i/>
-          <w:iCs/>
-        </w:rPr>
-        <w:t xml:space="preserve">minutes a day or in one sitting, exactly as the session taught it.</w:t>
-      </w:r>
-    </w:p>
-    <w:p>
-      <w:pPr>
-        <w:pStyle w:val="BodyText"/>
+        <w:spacing w:after="140"/>
       </w:pPr>
       <w:r>
         <w:rPr>
@@ -101,16 +67,6 @@
           <w:bCs/>
         </w:rPr>
         <w:t xml:space="preserve">Week one</w:t>
-      </w:r>
-      <w:r>
-        <w:t xml:space="preserve"> </w:t>
-      </w:r>
-      <w:r>
-        <w:rPr>
-          <w:i/>
-          <w:iCs/>
-        </w:rPr>
-        <w:t xml:space="preserve">(one box per day; if the practice asks for fewer, check the days you did it)</w:t>
       </w:r>
     </w:p>
     <w:tbl>
@@ -304,119 +260,9 @@
         </w:tc>
       </w:tr>
     </w:tbl>
-    <w:bookmarkEnd w:id="9"/>
-    <w:bookmarkStart w:id="10" w:name="the-end-of-week-one-check-in"/>
     <w:p>
       <w:pPr>
-        <w:pStyle w:val="Heading2"/>
-      </w:pPr>
-      <w:r>
-        <w:t xml:space="preserve">2. The end-of-week-one check-in</w:t>
-      </w:r>
-    </w:p>
-    <w:p>
-      <w:pPr>
-        <w:pStyle w:val="FirstParagraph"/>
-      </w:pPr>
-      <w:r>
-        <w:t xml:space="preserve">My check-in partner for this cycle is:</w:t>
-      </w:r>
-      <w:r>
-        <w:t xml:space="preserve"> </w:t>
-      </w:r>
-      <w:r>
-        <w:rPr>
-          <w:b/>
-          <w:bCs/>
-        </w:rPr>
-        <w:t xml:space="preserve">______________________</w:t>
-      </w:r>
-      <w:r>
-        <w:t xml:space="preserve"> </w:t>
-      </w:r>
-      <w:r>
-        <w:rPr>
-          <w:i/>
-          <w:iCs/>
-        </w:rPr>
-        <w:t xml:space="preserve">(named aloud at commissioning; a new partner each cycle)</w:t>
-      </w:r>
-    </w:p>
-    <w:p>
-      <w:pPr>
-        <w:pStyle w:val="BodyText"/>
-      </w:pPr>
-      <w:r>
-        <w:t xml:space="preserve">At the end of week one, connect with your partner and report how it’s going</w:t>
-      </w:r>
-      <w:r>
-        <w:t xml:space="preserve"> </w:t>
-      </w:r>
-      <w:r>
-        <w:t xml:space="preserve">against the practice. A text, a call, or a hallway conversation all count.</w:t>
-      </w:r>
-      <w:r>
-        <w:t xml:space="preserve"> </w:t>
-      </w:r>
-      <w:r>
-        <w:t xml:space="preserve">You are not grading each other; you are expecting each other.</w:t>
-      </w:r>
-      <w:r>
-        <w:t xml:space="preserve"> </w:t>
-      </w:r>
-      <w:r>
-        <w:rPr>
-          <w:b/>
-          <w:bCs/>
-        </w:rPr>
-        <w:t xml:space="preserve">Done:</w:t>
-      </w:r>
-      <w:r>
-        <w:t xml:space="preserve"> </w:t>
-      </w:r>
-      <w:r>
-        <w:t xml:space="preserve">☐</w:t>
-      </w:r>
-    </w:p>
-    <w:bookmarkEnd w:id="10"/>
-    <w:bookmarkStart w:id="11" w:name="the-practice-week-two"/>
-    <w:p>
-      <w:pPr>
-        <w:pStyle w:val="Heading2"/>
-      </w:pPr>
-      <w:r>
-        <w:t xml:space="preserve">3. The practice — week two</w:t>
-      </w:r>
-    </w:p>
-    <w:p>
-      <w:pPr>
-        <w:pStyle w:val="FirstParagraph"/>
-      </w:pPr>
-      <w:r>
-        <w:rPr>
-          <w:i/>
-          <w:iCs/>
-        </w:rPr>
-        <w:t xml:space="preserve">Continue, deepen, or repeat, as the session specifies — written here in</w:t>
-      </w:r>
-      <w:r>
-        <w:rPr>
-          <w:i/>
-          <w:iCs/>
-        </w:rPr>
-        <w:t xml:space="preserve"> </w:t>
-      </w:r>
-      <w:r>
-        <w:rPr>
-          <w:i/>
-          <w:iCs/>
-        </w:rPr>
-        <w:t xml:space="preserve">one or two sentences.</w:t>
-      </w:r>
-    </w:p>
-    <w:p>
-      <w:pPr>
-        <w:pStyle w:val="BodyText"/>
+        <w:spacing w:after="140"/>
       </w:pPr>
       <w:r>
         <w:rPr>
@@ -617,6 +463,165 @@
         </w:tc>
       </w:tr>
     </w:tbl>
+    <w:p>
+      <w:pPr>
+        <w:spacing w:after="140"/>
+      </w:pPr>
+      <w:r>
+        <w:rPr>
+          <w:i/>
+          <w:iCs/>
+          <w:sz w:val="20"/>
+          <w:szCs w:val="20"/>
+        </w:rPr>
+        <w:t xml:space="preserve">One box per day. A missed box is never a failure — it is an invitation to return.</w:t>
+      </w:r>
+    </w:p>
+    <w:bookmarkStart w:id="9" w:name="the-practice-week-one"/>
+    <w:p>
+      <w:pPr>
+        <w:pStyle w:val="Heading2"/>
+      </w:pPr>
+      <w:r>
+        <w:t xml:space="preserve">1. The practice — week one</w:t>
+      </w:r>
+    </w:p>
+    <w:p>
+      <w:pPr>
+        <w:pStyle w:val="FirstParagraph"/>
+      </w:pPr>
+      <w:r>
+        <w:rPr>
+          <w:i/>
+          <w:iCs/>
+        </w:rPr>
+        <w:t xml:space="preserve">One practice, stated in two or three sentences, doable in five to ten</w:t>
+      </w:r>
+      <w:r>
+        <w:rPr>
+          <w:i/>
+          <w:iCs/>
+        </w:rPr>
+        <w:t xml:space="preserve"> </w:t>
+      </w:r>
+      <w:r>
+        <w:rPr>
+          <w:i/>
+          <w:iCs/>
+        </w:rPr>
+        <w:t xml:space="preserve">minutes a day or in one sitting, exactly as the session taught it.</w:t>
+      </w:r>
+    </w:p>
+    <w:bookmarkEnd w:id="9"/>
+    <w:bookmarkStart w:id="10" w:name="the-end-of-week-one-check-in"/>
+    <w:p>
+      <w:pPr>
+        <w:pStyle w:val="Heading2"/>
+      </w:pPr>
+      <w:r>
+        <w:t xml:space="preserve">2. The end-of-week-one check-in</w:t>
+      </w:r>
+    </w:p>
+    <w:p>
+      <w:pPr>
+        <w:pStyle w:val="FirstParagraph"/>
+      </w:pPr>
+      <w:r>
+        <w:t xml:space="preserve">My check-in partner for this cycle is:</w:t>
+      </w:r>
+      <w:r>
+        <w:t xml:space="preserve"> </w:t>
+      </w:r>
+      <w:r>
+        <w:rPr>
+          <w:b/>
+          <w:bCs/>
+        </w:rPr>
+        <w:t xml:space="preserve">______________________</w:t>
+      </w:r>
+      <w:r>
+        <w:t xml:space="preserve"> </w:t>
+      </w:r>
+      <w:r>
+        <w:rPr>
+          <w:i/>
+          <w:iCs/>
+        </w:rPr>
+        <w:t xml:space="preserve">(named aloud at commissioning; a new partner each cycle)</w:t>
+      </w:r>
+    </w:p>
+    <w:p>
+      <w:pPr>
+        <w:pStyle w:val="BodyText"/>
+      </w:pPr>
+      <w:r>
+        <w:t xml:space="preserve">At the end of week one, connect with your partner and report how it’s going</w:t>
+      </w:r>
+      <w:r>
+        <w:t xml:space="preserve"> </w:t>
+      </w:r>
+      <w:r>
+        <w:t xml:space="preserve">against the practice. A text, a call, or a hallway conversation all count.</w:t>
+      </w:r>
+      <w:r>
+        <w:t xml:space="preserve"> </w:t>
+      </w:r>
+      <w:r>
+        <w:t xml:space="preserve">You are not grading each other; you are expecting each other.</w:t>
+      </w:r>
+      <w:r>
+        <w:t xml:space="preserve"> </w:t>
+      </w:r>
+      <w:r>
+        <w:rPr>
+          <w:b/>
+          <w:bCs/>
+        </w:rPr>
+        <w:t xml:space="preserve">Done:</w:t>
+      </w:r>
+      <w:r>
+        <w:t xml:space="preserve"> </w:t>
+      </w:r>
+      <w:r>
+        <w:t xml:space="preserve">☐</w:t>
+      </w:r>
+    </w:p>
+    <w:bookmarkEnd w:id="10"/>
+    <w:bookmarkStart w:id="11" w:name="the-practice-week-two"/>
+    <w:p>
+      <w:pPr>
+        <w:pStyle w:val="Heading2"/>
+      </w:pPr>
+      <w:r>
+        <w:t xml:space="preserve">3. The practice — week two</w:t>
+      </w:r>
+    </w:p>
+    <w:p>
+      <w:pPr>
+        <w:pStyle w:val="FirstParagraph"/>
+      </w:pPr>
+      <w:r>
+        <w:rPr>
+          <w:i/>
+          <w:iCs/>
+        </w:rPr>
+        <w:t xml:space="preserve">Continue, deepen, or repeat, as the session specifies — written here in</w:t>
+      </w:r>
+      <w:r>
+        <w:rPr>
+          <w:i/>
+          <w:iCs/>
+        </w:rPr>
+        <w:t xml:space="preserve"> </w:t>
+      </w:r>
+      <w:r>
+        <w:rPr>
+          <w:i/>
+          <w:iCs/>
+        </w:rPr>
+        <w:t xml:space="preserve">one or two sentences.</w:t>
+      </w:r>
+    </w:p>
     <w:bookmarkEnd w:id="11"/>
     <w:bookmarkStart w:id="12" w:name="one-sentence-of-preparation"/>
     <w:p>
@@ -674,18 +679,6 @@
         <w:pict>
           <v:rect style="width:0;height:1.5pt" o:hralign="center" o:hrstd="t" o:hr="t"/>
         </w:pict>
-      </w:r>
-    </w:p>
-    <w:p>
-      <w:pPr>
-        <w:pStyle w:val="FirstParagraph"/>
-      </w:pPr>
-      <w:r>
-        <w:rPr>
-          <w:i/>
-          <w:iCs/>
-        </w:rPr>
-        <w:t xml:space="preserve">A missed box is never a failure — it is an invitation to return.</w:t>
       </w:r>
     </w:p>
     <w:bookmarkEnd w:id="12"/>

</xml_diff>